<commit_message>
fix report generation: preserve shapes, fix calculations, add toggle
- Preserve arrow/drawing shapes in Word output (existing filter confirmed working)
- Add CO2 total calculation including both gas and electricity emissions
- Add co2_tot_new for post-installation scenario
- Fix e_from_mln to use 2025 data, add e_to_mln after FES+gelio savings
- Fix qov_to to show realistic improvement target (80% rounded to 25)
- Fix gk/tk_sum to show kWh not cost; fix e_mln to show total cost in millions
- Fix -0.0% display artifact in percentage columns
- Preserve m² superscript in Word output (two-pass run replacement)
- Add qutilarda_qizish_mavju_emas toggle in Measurements form
- Fix apl_total to kWh/day; fix fes_mln as integer; fix fes_payb prefix
- Resize pie charts to 3.2×2.8, bar chart to 2.5×1.75
- Fix r3/r4 auto-generated lux (300-500), temp (≥20), humidity (≥30)
- Fix U-values to always stay below norm

Co-Authored-By: Claude Sonnet 4.6 <noreply@anthropic.com>
</commit_message>
<xml_diff>
--- a/backend/template.docx
+++ b/backend/template.docx
@@ -40,7 +40,7 @@
                     <pic:cNvPicPr/>
                   </pic:nvPicPr>
                   <pic:blipFill>
-                    <a:blip r:embed="rId7" cstate="print">
+                    <a:blip r:embed="rId8" cstate="print">
                       <a:extLst>
                         <a:ext uri="{28A0092B-C50C-407E-A947-70E740481C1C}">
                           <a14:useLocalDpi xmlns:a14="http://schemas.microsoft.com/office/drawing/2010/main" val="0"/>
@@ -892,7 +892,7 @@
                 <w:bCs/>
                 <w:color w:val="1B3A5C"/>
               </w:rPr>
-              <w:t>region}} {{</w:t>
+              <w:t>region}}</w:t>
             </w:r>
             <w:r>
               <w:rPr>
@@ -900,10 +900,8 @@
                 <w:b/>
                 <w:bCs/>
                 <w:color w:val="1B3A5C"/>
-                <w:sz w:val="22"/>
-                <w:szCs w:val="22"/>
-              </w:rPr>
-              <w:t>city</w:t>
+              </w:rPr>
+              <w:t>,</w:t>
             </w:r>
             <w:r>
               <w:rPr>
@@ -912,7 +910,45 @@
                 <w:bCs/>
                 <w:color w:val="1B3A5C"/>
               </w:rPr>
-              <w:t>}} {{mfy}} {{street}} {{house</w:t>
+              <w:t xml:space="preserve"> {{</w:t>
+            </w:r>
+            <w:r>
+              <w:rPr>
+                <w:rFonts w:ascii="Cambria" w:eastAsia="Calibri" w:hAnsi="Cambria"/>
+                <w:b/>
+                <w:bCs/>
+                <w:color w:val="1B3A5C"/>
+                <w:sz w:val="22"/>
+                <w:szCs w:val="22"/>
+              </w:rPr>
+              <w:t>city</w:t>
+            </w:r>
+            <w:r>
+              <w:rPr>
+                <w:rFonts w:ascii="Cambria" w:eastAsia="Calibri" w:hAnsi="Cambria"/>
+                <w:b/>
+                <w:bCs/>
+                <w:color w:val="1B3A5C"/>
+              </w:rPr>
+              <w:t>}}</w:t>
+            </w:r>
+            <w:r>
+              <w:rPr>
+                <w:rFonts w:ascii="Cambria" w:eastAsia="Calibri" w:hAnsi="Cambria"/>
+                <w:b/>
+                <w:bCs/>
+                <w:color w:val="1B3A5C"/>
+              </w:rPr>
+              <w:t>,</w:t>
+            </w:r>
+            <w:r>
+              <w:rPr>
+                <w:rFonts w:ascii="Cambria" w:eastAsia="Calibri" w:hAnsi="Cambria"/>
+                <w:b/>
+                <w:bCs/>
+                <w:color w:val="1B3A5C"/>
+              </w:rPr>
+              <w:t xml:space="preserve"> {{mfy}} {{street}} {{house</w:t>
             </w:r>
             <w:r>
               <w:rPr>
@@ -1405,7 +1441,43 @@
                 <w:sz w:val="22"/>
                 <w:szCs w:val="22"/>
               </w:rPr>
-              <w:t>{{region}} {{city}} {{mfy}} {{street}} {{house}}</w:t>
+              <w:t>{{region}}</w:t>
+            </w:r>
+            <w:r>
+              <w:rPr>
+                <w:rFonts w:ascii="Cambria" w:eastAsia="Calibri" w:hAnsi="Cambria"/>
+                <w:color w:val="1A1A2E"/>
+                <w:sz w:val="22"/>
+                <w:szCs w:val="22"/>
+              </w:rPr>
+              <w:t>,</w:t>
+            </w:r>
+            <w:r>
+              <w:rPr>
+                <w:rFonts w:ascii="Cambria" w:eastAsia="Calibri" w:hAnsi="Cambria"/>
+                <w:color w:val="1A1A2E"/>
+                <w:sz w:val="22"/>
+                <w:szCs w:val="22"/>
+              </w:rPr>
+              <w:t xml:space="preserve"> {{city}}</w:t>
+            </w:r>
+            <w:r>
+              <w:rPr>
+                <w:rFonts w:ascii="Cambria" w:eastAsia="Calibri" w:hAnsi="Cambria"/>
+                <w:color w:val="1A1A2E"/>
+                <w:sz w:val="22"/>
+                <w:szCs w:val="22"/>
+              </w:rPr>
+              <w:t>,</w:t>
+            </w:r>
+            <w:r>
+              <w:rPr>
+                <w:rFonts w:ascii="Cambria" w:eastAsia="Calibri" w:hAnsi="Cambria"/>
+                <w:color w:val="1A1A2E"/>
+                <w:sz w:val="22"/>
+                <w:szCs w:val="22"/>
+              </w:rPr>
+              <w:t xml:space="preserve"> {{mfy}} {{street}} {{house}}</w:t>
             </w:r>
           </w:p>
         </w:tc>
@@ -3411,6 +3483,86 @@
           <w:lang w:val="en-US"/>
         </w:rPr>
       </w:pPr>
+      <w:r>
+        <w:rPr>
+          <w:rFonts w:ascii="Cambria" w:hAnsi="Cambria"/>
+          <w:noProof/>
+        </w:rPr>
+        <mc:AlternateContent>
+          <mc:Choice Requires="wps">
+            <w:drawing>
+              <wp:anchor distT="0" distB="0" distL="114300" distR="114300" simplePos="0" relativeHeight="251692032" behindDoc="0" locked="0" layoutInCell="1" allowOverlap="1" wp14:anchorId="499FAF16" wp14:editId="2915DFCA">
+                <wp:simplePos x="0" y="0"/>
+                <wp:positionH relativeFrom="column">
+                  <wp:posOffset>2559987</wp:posOffset>
+                </wp:positionH>
+                <wp:positionV relativeFrom="paragraph">
+                  <wp:posOffset>2734703</wp:posOffset>
+                </wp:positionV>
+                <wp:extent cx="860719" cy="592396"/>
+                <wp:effectExtent l="25400" t="38100" r="3175" b="30480"/>
+                <wp:wrapNone/>
+                <wp:docPr id="762688125" name="Straight Arrow Connector 1"/>
+                <wp:cNvGraphicFramePr/>
+                <a:graphic xmlns:a="http://schemas.openxmlformats.org/drawingml/2006/main">
+                  <a:graphicData uri="http://schemas.microsoft.com/office/word/2010/wordprocessingShape">
+                    <wps:wsp>
+                      <wps:cNvCnPr/>
+                      <wps:spPr>
+                        <a:xfrm flipH="1">
+                          <a:off x="0" y="0"/>
+                          <a:ext cx="860719" cy="592396"/>
+                        </a:xfrm>
+                        <a:prstGeom prst="straightConnector1">
+                          <a:avLst/>
+                        </a:prstGeom>
+                        <a:ln w="69850" cmpd="tri">
+                          <a:solidFill>
+                            <a:srgbClr val="EE0000"/>
+                          </a:solidFill>
+                          <a:tailEnd type="stealth"/>
+                        </a:ln>
+                      </wps:spPr>
+                      <wps:style>
+                        <a:lnRef idx="2">
+                          <a:schemeClr val="accent1"/>
+                        </a:lnRef>
+                        <a:fillRef idx="0">
+                          <a:schemeClr val="accent1"/>
+                        </a:fillRef>
+                        <a:effectRef idx="1">
+                          <a:schemeClr val="accent1"/>
+                        </a:effectRef>
+                        <a:fontRef idx="minor">
+                          <a:schemeClr val="tx1"/>
+                        </a:fontRef>
+                      </wps:style>
+                      <wps:bodyPr/>
+                    </wps:wsp>
+                  </a:graphicData>
+                </a:graphic>
+                <wp14:sizeRelH relativeFrom="margin">
+                  <wp14:pctWidth>0</wp14:pctWidth>
+                </wp14:sizeRelH>
+                <wp14:sizeRelV relativeFrom="margin">
+                  <wp14:pctHeight>0</wp14:pctHeight>
+                </wp14:sizeRelV>
+              </wp:anchor>
+            </w:drawing>
+          </mc:Choice>
+          <mc:Fallback>
+            <w:pict>
+              <v:shapetype w14:anchorId="2988225F" id="_x0000_t32" coordsize="21600,21600" o:spt="32" o:oned="t" path="m,l21600,21600e" filled="f">
+                <v:path arrowok="t" fillok="f" o:connecttype="none"/>
+                <o:lock v:ext="edit" shapetype="t"/>
+              </v:shapetype>
+              <v:shape id="Straight Arrow Connector 1" o:spid="_x0000_s1026" type="#_x0000_t32" style="position:absolute;margin-left:201.55pt;margin-top:215.35pt;width:67.75pt;height:46.65pt;flip:x;z-index:251692032;visibility:visible;mso-wrap-style:square;mso-width-percent:0;mso-height-percent:0;mso-wrap-distance-left:9pt;mso-wrap-distance-top:0;mso-wrap-distance-right:9pt;mso-wrap-distance-bottom:0;mso-position-horizontal:absolute;mso-position-horizontal-relative:text;mso-position-vertical:absolute;mso-position-vertical-relative:text;mso-width-percent:0;mso-height-percent:0;mso-width-relative:margin;mso-height-relative:margin" o:gfxdata="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" strokecolor="#e00" strokeweight="5.5pt">
+                <v:stroke endarrow="classic" linestyle="thickBetweenThin" joinstyle="miter"/>
+              </v:shape>
+            </w:pict>
+          </mc:Fallback>
+        </mc:AlternateContent>
+      </w:r>
     </w:p>
     <w:tbl>
       <w:tblPr>
@@ -3605,86 +3757,6 @@
             </w:pPr>
             <w:r>
               <w:t xml:space="preserve">{{photo_sec2_1}} </w:t>
-            </w:r>
-            <w:r>
-              <w:rPr>
-                <w:rFonts w:ascii="Cambria" w:hAnsi="Cambria"/>
-                <w:noProof/>
-              </w:rPr>
-              <mc:AlternateContent>
-                <mc:Choice Requires="wps">
-                  <w:drawing>
-                    <wp:anchor distT="0" distB="0" distL="114300" distR="114300" simplePos="0" relativeHeight="251692032" behindDoc="0" locked="0" layoutInCell="1" allowOverlap="1" wp14:anchorId="499FAF16" wp14:editId="2A7E9A75">
-                      <wp:simplePos x="0" y="0"/>
-                      <wp:positionH relativeFrom="column">
-                        <wp:posOffset>1496459</wp:posOffset>
-                      </wp:positionH>
-                      <wp:positionV relativeFrom="paragraph">
-                        <wp:posOffset>4156</wp:posOffset>
-                      </wp:positionV>
-                      <wp:extent cx="455033" cy="366257"/>
-                      <wp:effectExtent l="25400" t="12700" r="15240" b="27940"/>
-                      <wp:wrapNone/>
-                      <wp:docPr id="762688125" name="Straight Arrow Connector 1"/>
-                      <wp:cNvGraphicFramePr/>
-                      <a:graphic xmlns:a="http://schemas.openxmlformats.org/drawingml/2006/main">
-                        <a:graphicData uri="http://schemas.microsoft.com/office/word/2010/wordprocessingShape">
-                          <wps:wsp>
-                            <wps:cNvCnPr/>
-                            <wps:spPr>
-                              <a:xfrm flipH="1">
-                                <a:off x="0" y="0"/>
-                                <a:ext cx="455033" cy="366257"/>
-                              </a:xfrm>
-                              <a:prstGeom prst="straightConnector1">
-                                <a:avLst/>
-                              </a:prstGeom>
-                              <a:ln>
-                                <a:solidFill>
-                                  <a:srgbClr val="EE0000"/>
-                                </a:solidFill>
-                                <a:tailEnd type="triangle"/>
-                              </a:ln>
-                            </wps:spPr>
-                            <wps:style>
-                              <a:lnRef idx="2">
-                                <a:schemeClr val="accent1"/>
-                              </a:lnRef>
-                              <a:fillRef idx="0">
-                                <a:schemeClr val="accent1"/>
-                              </a:fillRef>
-                              <a:effectRef idx="1">
-                                <a:schemeClr val="accent1"/>
-                              </a:effectRef>
-                              <a:fontRef idx="minor">
-                                <a:schemeClr val="tx1"/>
-                              </a:fontRef>
-                            </wps:style>
-                            <wps:bodyPr/>
-                          </wps:wsp>
-                        </a:graphicData>
-                      </a:graphic>
-                      <wp14:sizeRelH relativeFrom="margin">
-                        <wp14:pctWidth>0</wp14:pctWidth>
-                      </wp14:sizeRelH>
-                      <wp14:sizeRelV relativeFrom="margin">
-                        <wp14:pctHeight>0</wp14:pctHeight>
-                      </wp14:sizeRelV>
-                    </wp:anchor>
-                  </w:drawing>
-                </mc:Choice>
-                <mc:Fallback>
-                  <w:pict>
-                    <v:shapetype w14:anchorId="0A279E8E" id="_x0000_t32" coordsize="21600,21600" o:spt="32" o:oned="t" path="m,l21600,21600e" filled="f">
-                      <v:path arrowok="t" fillok="f" o:connecttype="none"/>
-                      <o:lock v:ext="edit" shapetype="t"/>
-                    </v:shapetype>
-                    <v:shape id="Straight Arrow Connector 1" o:spid="_x0000_s1026" type="#_x0000_t32" style="position:absolute;margin-left:117.85pt;margin-top:.35pt;width:35.85pt;height:28.85pt;flip:x;z-index:251692032;visibility:visible;mso-wrap-style:square;mso-width-percent:0;mso-height-percent:0;mso-wrap-distance-left:9pt;mso-wrap-distance-top:0;mso-wrap-distance-right:9pt;mso-wrap-distance-bottom:0;mso-position-horizontal:absolute;mso-position-horizontal-relative:text;mso-position-vertical:absolute;mso-position-vertical-relative:text;mso-width-percent:0;mso-height-percent:0;mso-width-relative:margin;mso-height-relative:margin" o:gfxdata="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" strokecolor="#e00" strokeweight="1.5pt">
-                      <v:stroke endarrow="block" joinstyle="miter"/>
-                    </v:shape>
-                  </w:pict>
-                </mc:Fallback>
-              </mc:AlternateContent>
             </w:r>
           </w:p>
         </w:tc>
@@ -5311,7 +5383,6 @@
               <w:bottom w:val="single" w:sz="1" w:space="0" w:color="C5D5E8"/>
               <w:right w:val="single" w:sz="1" w:space="0" w:color="C5D5E8"/>
             </w:tcBorders>
-            <w:shd w:val="clear" w:color="auto" w:fill="F3F6FA"/>
             <w:tcMar>
               <w:top w:w="80" w:type="dxa"/>
               <w:left w:w="120" w:type="dxa"/>
@@ -5348,7 +5419,6 @@
               <w:bottom w:val="single" w:sz="1" w:space="0" w:color="C5D5E8"/>
               <w:right w:val="single" w:sz="1" w:space="0" w:color="C5D5E8"/>
             </w:tcBorders>
-            <w:shd w:val="clear" w:color="auto" w:fill="F3F6FA"/>
             <w:tcMar>
               <w:top w:w="80" w:type="dxa"/>
               <w:left w:w="120" w:type="dxa"/>
@@ -5411,7 +5481,6 @@
               <w:bottom w:val="single" w:sz="1" w:space="0" w:color="C5D5E8"/>
               <w:right w:val="single" w:sz="1" w:space="0" w:color="C5D5E8"/>
             </w:tcBorders>
-            <w:shd w:val="clear" w:color="auto" w:fill="F3F6FA"/>
             <w:tcMar>
               <w:top w:w="80" w:type="dxa"/>
               <w:left w:w="120" w:type="dxa"/>
@@ -7982,6 +8051,50 @@
               </w:rPr>
               <w:t>}}</w:t>
             </w:r>
+            <w:r>
+              <w:rPr>
+                <w:rFonts w:ascii="Cambria" w:eastAsia="Calibri" w:hAnsi="Cambria"/>
+                <w:color w:val="1A1A2E"/>
+                <w:sz w:val="22"/>
+                <w:szCs w:val="22"/>
+                <w:lang w:val="en-US"/>
+              </w:rPr>
+              <w:t xml:space="preserve"> kW*</w:t>
+            </w:r>
+            <w:proofErr w:type="spellStart"/>
+            <w:r>
+              <w:rPr>
+                <w:rFonts w:ascii="Cambria" w:eastAsia="Calibri" w:hAnsi="Cambria"/>
+                <w:color w:val="1A1A2E"/>
+                <w:sz w:val="22"/>
+                <w:szCs w:val="22"/>
+                <w:lang w:val="en-US"/>
+              </w:rPr>
+              <w:t>soat</w:t>
+            </w:r>
+            <w:proofErr w:type="spellEnd"/>
+            <w:r>
+              <w:rPr>
+                <w:rFonts w:ascii="Cambria" w:eastAsia="Calibri" w:hAnsi="Cambria"/>
+                <w:color w:val="1A1A2E"/>
+                <w:sz w:val="22"/>
+                <w:szCs w:val="22"/>
+                <w:lang w:val="en-US"/>
+              </w:rPr>
+              <w:t>/</w:t>
+            </w:r>
+            <w:proofErr w:type="spellStart"/>
+            <w:r>
+              <w:rPr>
+                <w:rFonts w:ascii="Cambria" w:eastAsia="Calibri" w:hAnsi="Cambria"/>
+                <w:color w:val="1A1A2E"/>
+                <w:sz w:val="22"/>
+                <w:szCs w:val="22"/>
+                <w:lang w:val="en-US"/>
+              </w:rPr>
+              <w:t>sutka</w:t>
+            </w:r>
+            <w:proofErr w:type="spellEnd"/>
           </w:p>
         </w:tc>
       </w:tr>
@@ -23596,25 +23709,6 @@
         </w:tc>
       </w:tr>
     </w:tbl>
-    <w:p>
-      <w:pPr>
-        <w:spacing w:before="120" w:after="80"/>
-        <w:rPr>
-          <w:rFonts w:ascii="Cambria" w:hAnsi="Cambria"/>
-          <w:sz w:val="4"/>
-          <w:szCs w:val="4"/>
-        </w:rPr>
-      </w:pPr>
-    </w:p>
-    <w:p>
-      <w:pPr>
-        <w:spacing w:before="120" w:after="80"/>
-        <w:rPr>
-          <w:rFonts w:ascii="Cambria" w:hAnsi="Cambria"/>
-          <w:lang w:val="en-US"/>
-        </w:rPr>
-      </w:pPr>
-    </w:p>
     <w:p>
       <w:pPr>
         <w:pBdr>
@@ -25883,15 +25977,6 @@
         </w:rPr>
       </w:pPr>
     </w:p>
-    <w:p>
-      <w:pPr>
-        <w:spacing w:after="160"/>
-        <w:rPr>
-          <w:rFonts w:ascii="Cambria" w:hAnsi="Cambria"/>
-          <w:lang w:val="en-US"/>
-        </w:rPr>
-      </w:pPr>
-    </w:p>
     <w:tbl>
       <w:tblPr>
         <w:tblW w:w="9638" w:type="dxa"/>
@@ -26138,58 +26223,6 @@
         </w:tc>
       </w:tr>
     </w:tbl>
-    <w:p>
-      <w:pPr>
-        <w:spacing w:after="160"/>
-        <w:rPr>
-          <w:rFonts w:ascii="Cambria" w:hAnsi="Cambria"/>
-          <w:lang w:val="en-US"/>
-        </w:rPr>
-      </w:pPr>
-    </w:p>
-    <w:p>
-      <w:pPr>
-        <w:spacing w:after="160"/>
-        <w:rPr>
-          <w:rFonts w:ascii="Cambria" w:hAnsi="Cambria"/>
-        </w:rPr>
-      </w:pPr>
-    </w:p>
-    <w:p>
-      <w:pPr>
-        <w:spacing w:after="160"/>
-        <w:rPr>
-          <w:rFonts w:ascii="Cambria" w:hAnsi="Cambria"/>
-          <w:lang w:val="en-US"/>
-        </w:rPr>
-      </w:pPr>
-    </w:p>
-    <w:p>
-      <w:pPr>
-        <w:spacing w:before="200" w:after="80"/>
-        <w:rPr>
-          <w:rFonts w:ascii="Cambria" w:eastAsia="Calibri" w:hAnsi="Cambria"/>
-          <w:b/>
-          <w:bCs/>
-          <w:color w:val="2E6DA4"/>
-          <w:sz w:val="22"/>
-          <w:szCs w:val="22"/>
-        </w:rPr>
-      </w:pPr>
-    </w:p>
-    <w:p>
-      <w:pPr>
-        <w:spacing w:before="200" w:after="80"/>
-        <w:rPr>
-          <w:rFonts w:ascii="Cambria" w:eastAsia="Calibri" w:hAnsi="Cambria"/>
-          <w:b/>
-          <w:bCs/>
-          <w:color w:val="2E6DA4"/>
-          <w:sz w:val="22"/>
-          <w:szCs w:val="22"/>
-        </w:rPr>
-      </w:pPr>
-    </w:p>
     <w:p>
       <w:pPr>
         <w:spacing w:before="200" w:after="80"/>
@@ -27401,7 +27434,6 @@
     </w:tbl>
     <w:p>
       <w:pPr>
-        <w:spacing w:before="200" w:after="80"/>
         <w:rPr>
           <w:rFonts w:ascii="Cambria" w:eastAsia="Calibri" w:hAnsi="Cambria"/>
           <w:b/>
@@ -27633,45 +27665,6 @@
         </w:tc>
       </w:tr>
     </w:tbl>
-    <w:p>
-      <w:pPr>
-        <w:spacing w:before="200" w:after="80"/>
-        <w:rPr>
-          <w:rFonts w:ascii="Cambria" w:eastAsia="Calibri" w:hAnsi="Cambria"/>
-          <w:b/>
-          <w:bCs/>
-          <w:color w:val="2E6DA4"/>
-          <w:sz w:val="22"/>
-          <w:szCs w:val="22"/>
-        </w:rPr>
-      </w:pPr>
-    </w:p>
-    <w:p>
-      <w:pPr>
-        <w:spacing w:before="200" w:after="80"/>
-        <w:rPr>
-          <w:rFonts w:ascii="Cambria" w:eastAsia="Calibri" w:hAnsi="Cambria"/>
-          <w:b/>
-          <w:bCs/>
-          <w:color w:val="2E6DA4"/>
-          <w:sz w:val="22"/>
-          <w:szCs w:val="22"/>
-        </w:rPr>
-      </w:pPr>
-    </w:p>
-    <w:p>
-      <w:pPr>
-        <w:spacing w:before="200" w:after="80"/>
-        <w:rPr>
-          <w:rFonts w:ascii="Cambria" w:eastAsia="Calibri" w:hAnsi="Cambria"/>
-          <w:b/>
-          <w:bCs/>
-          <w:color w:val="2E6DA4"/>
-          <w:sz w:val="22"/>
-          <w:szCs w:val="22"/>
-        </w:rPr>
-      </w:pPr>
-    </w:p>
     <w:p>
       <w:pPr>
         <w:spacing w:before="200" w:after="80"/>
@@ -28208,7 +28201,6 @@
                 <w:sz w:val="22"/>
                 <w:szCs w:val="22"/>
               </w:rPr>
-              <w:lastRenderedPageBreak/>
               <w:t>Konstruksiya</w:t>
             </w:r>
           </w:p>
@@ -30259,62 +30251,6 @@
         <w:pStyle w:val="p1"/>
         <w:rPr>
           <w:rFonts w:ascii="Cambria" w:hAnsi="Cambria"/>
-          <w:sz w:val="22"/>
-          <w:szCs w:val="22"/>
-          <w:lang w:val="en-US"/>
-        </w:rPr>
-      </w:pPr>
-    </w:p>
-    <w:p>
-      <w:pPr>
-        <w:pStyle w:val="p1"/>
-        <w:rPr>
-          <w:rFonts w:ascii="Cambria" w:hAnsi="Cambria"/>
-          <w:lang w:val="en-US"/>
-        </w:rPr>
-      </w:pPr>
-    </w:p>
-    <w:p>
-      <w:pPr>
-        <w:pStyle w:val="p1"/>
-        <w:rPr>
-          <w:rFonts w:ascii="Cambria" w:hAnsi="Cambria"/>
-          <w:lang w:val="en-US"/>
-        </w:rPr>
-      </w:pPr>
-    </w:p>
-    <w:p>
-      <w:pPr>
-        <w:pStyle w:val="p1"/>
-        <w:rPr>
-          <w:rFonts w:ascii="Cambria" w:hAnsi="Cambria"/>
-          <w:lang w:val="en-US"/>
-        </w:rPr>
-      </w:pPr>
-    </w:p>
-    <w:p>
-      <w:pPr>
-        <w:pStyle w:val="p1"/>
-        <w:rPr>
-          <w:rFonts w:ascii="Cambria" w:hAnsi="Cambria"/>
-          <w:lang w:val="en-US"/>
-        </w:rPr>
-      </w:pPr>
-    </w:p>
-    <w:p>
-      <w:pPr>
-        <w:pStyle w:val="p1"/>
-        <w:rPr>
-          <w:rFonts w:ascii="Cambria" w:hAnsi="Cambria"/>
-          <w:lang w:val="en-US"/>
-        </w:rPr>
-      </w:pPr>
-    </w:p>
-    <w:p>
-      <w:pPr>
-        <w:pStyle w:val="p1"/>
-        <w:rPr>
-          <w:rFonts w:ascii="Cambria" w:hAnsi="Cambria"/>
           <w:lang w:val="en-US"/>
         </w:rPr>
       </w:pPr>
@@ -30328,6 +30264,7 @@
           <w:sz w:val="22"/>
           <w:szCs w:val="22"/>
         </w:rPr>
+        <w:lastRenderedPageBreak/>
         <w:t>Teplovizor</w:t>
       </w:r>
       <w:proofErr w:type="spellEnd"/>
@@ -30411,9 +30348,9 @@
       <w:tblGrid>
         <w:gridCol w:w="1598"/>
         <w:gridCol w:w="1533"/>
-        <w:gridCol w:w="2164"/>
-        <w:gridCol w:w="2268"/>
-        <w:gridCol w:w="1934"/>
+        <w:gridCol w:w="2130"/>
+        <w:gridCol w:w="2154"/>
+        <w:gridCol w:w="2082"/>
       </w:tblGrid>
       <w:tr>
         <w:trPr>
@@ -30501,7 +30438,7 @@
         </w:tc>
         <w:tc>
           <w:tcPr>
-            <w:tcW w:w="2192" w:type="dxa"/>
+            <w:tcW w:w="2135" w:type="dxa"/>
             <w:tcBorders>
               <w:top w:val="single" w:sz="1" w:space="0" w:color="1B3A5C"/>
               <w:left w:val="single" w:sz="1" w:space="0" w:color="1B3A5C"/>
@@ -30541,7 +30478,7 @@
         </w:tc>
         <w:tc>
           <w:tcPr>
-            <w:tcW w:w="4174" w:type="dxa"/>
+            <w:tcW w:w="4231" w:type="dxa"/>
             <w:gridSpan w:val="2"/>
             <w:tcBorders>
               <w:top w:val="single" w:sz="1" w:space="0" w:color="1B3A5C"/>
@@ -30656,7 +30593,7 @@
         </w:tc>
         <w:tc>
           <w:tcPr>
-            <w:tcW w:w="2192" w:type="dxa"/>
+            <w:tcW w:w="2135" w:type="dxa"/>
             <w:tcBorders>
               <w:top w:val="single" w:sz="1" w:space="0" w:color="C5D5E8"/>
               <w:left w:val="single" w:sz="1" w:space="0" w:color="C5D5E8"/>
@@ -30851,7 +30788,7 @@
         </w:tc>
         <w:tc>
           <w:tcPr>
-            <w:tcW w:w="2361" w:type="dxa"/>
+            <w:tcW w:w="1679" w:type="dxa"/>
             <w:tcBorders>
               <w:top w:val="single" w:sz="1" w:space="0" w:color="C5D5E8"/>
               <w:left w:val="single" w:sz="1" w:space="0" w:color="C5D5E8"/>
@@ -30864,6 +30801,7 @@
               <w:bottom w:w="80" w:type="dxa"/>
               <w:right w:w="120" w:type="dxa"/>
             </w:tcMar>
+            <w:vAlign w:val="center"/>
           </w:tcPr>
           <w:p>
             <w:pPr>
@@ -30881,13 +30819,14 @@
         </w:tc>
         <w:tc>
           <w:tcPr>
-            <w:tcW w:w="1813" w:type="dxa"/>
+            <w:tcW w:w="2552" w:type="dxa"/>
             <w:tcBorders>
               <w:top w:val="single" w:sz="1" w:space="0" w:color="C5D5E8"/>
               <w:left w:val="single" w:sz="1" w:space="0" w:color="C5D5E8"/>
               <w:bottom w:val="single" w:sz="1" w:space="0" w:color="C5D5E8"/>
               <w:right w:val="single" w:sz="1" w:space="0" w:color="C5D5E8"/>
             </w:tcBorders>
+            <w:vAlign w:val="center"/>
           </w:tcPr>
           <w:p>
             <w:pPr>
@@ -30979,7 +30918,7 @@
         </w:tc>
         <w:tc>
           <w:tcPr>
-            <w:tcW w:w="2192" w:type="dxa"/>
+            <w:tcW w:w="2135" w:type="dxa"/>
             <w:tcBorders>
               <w:top w:val="single" w:sz="1" w:space="0" w:color="C5D5E8"/>
               <w:left w:val="single" w:sz="1" w:space="0" w:color="C5D5E8"/>
@@ -31140,7 +31079,7 @@
         </w:tc>
         <w:tc>
           <w:tcPr>
-            <w:tcW w:w="2361" w:type="dxa"/>
+            <w:tcW w:w="1679" w:type="dxa"/>
             <w:tcBorders>
               <w:top w:val="single" w:sz="1" w:space="0" w:color="C5D5E8"/>
               <w:left w:val="single" w:sz="1" w:space="0" w:color="C5D5E8"/>
@@ -31154,6 +31093,7 @@
               <w:bottom w:w="80" w:type="dxa"/>
               <w:right w:w="120" w:type="dxa"/>
             </w:tcMar>
+            <w:vAlign w:val="center"/>
           </w:tcPr>
           <w:p>
             <w:pPr>
@@ -31171,7 +31111,7 @@
         </w:tc>
         <w:tc>
           <w:tcPr>
-            <w:tcW w:w="1813" w:type="dxa"/>
+            <w:tcW w:w="2552" w:type="dxa"/>
             <w:tcBorders>
               <w:top w:val="single" w:sz="1" w:space="0" w:color="C5D5E8"/>
               <w:left w:val="single" w:sz="1" w:space="0" w:color="C5D5E8"/>
@@ -31179,6 +31119,7 @@
               <w:right w:val="single" w:sz="1" w:space="0" w:color="C5D5E8"/>
             </w:tcBorders>
             <w:shd w:val="clear" w:color="auto" w:fill="F3F6FA"/>
+            <w:vAlign w:val="center"/>
           </w:tcPr>
           <w:p>
             <w:pPr>
@@ -31268,7 +31209,7 @@
         </w:tc>
         <w:tc>
           <w:tcPr>
-            <w:tcW w:w="2192" w:type="dxa"/>
+            <w:tcW w:w="2135" w:type="dxa"/>
             <w:tcBorders>
               <w:top w:val="single" w:sz="1" w:space="0" w:color="C5D5E8"/>
               <w:left w:val="single" w:sz="1" w:space="0" w:color="C5D5E8"/>
@@ -31404,7 +31345,7 @@
         </w:tc>
         <w:tc>
           <w:tcPr>
-            <w:tcW w:w="2361" w:type="dxa"/>
+            <w:tcW w:w="1679" w:type="dxa"/>
             <w:tcBorders>
               <w:top w:val="single" w:sz="1" w:space="0" w:color="C5D5E8"/>
               <w:left w:val="single" w:sz="1" w:space="0" w:color="C5D5E8"/>
@@ -31417,6 +31358,7 @@
               <w:bottom w:w="80" w:type="dxa"/>
               <w:right w:w="120" w:type="dxa"/>
             </w:tcMar>
+            <w:vAlign w:val="center"/>
           </w:tcPr>
           <w:p>
             <w:pPr>
@@ -31434,13 +31376,14 @@
         </w:tc>
         <w:tc>
           <w:tcPr>
-            <w:tcW w:w="1813" w:type="dxa"/>
+            <w:tcW w:w="2552" w:type="dxa"/>
             <w:tcBorders>
               <w:top w:val="single" w:sz="1" w:space="0" w:color="C5D5E8"/>
               <w:left w:val="single" w:sz="1" w:space="0" w:color="C5D5E8"/>
               <w:bottom w:val="single" w:sz="1" w:space="0" w:color="C5D5E8"/>
               <w:right w:val="single" w:sz="1" w:space="0" w:color="C5D5E8"/>
             </w:tcBorders>
+            <w:vAlign w:val="center"/>
           </w:tcPr>
           <w:p>
             <w:pPr>
@@ -31490,7 +31433,6 @@
                 <w:sz w:val="22"/>
                 <w:szCs w:val="22"/>
               </w:rPr>
-              <w:lastRenderedPageBreak/>
               <w:t>Elektr taqsimlash qutisi</w:t>
             </w:r>
           </w:p>
@@ -31533,7 +31475,7 @@
         </w:tc>
         <w:tc>
           <w:tcPr>
-            <w:tcW w:w="2192" w:type="dxa"/>
+            <w:tcW w:w="2135" w:type="dxa"/>
             <w:tcBorders>
               <w:top w:val="single" w:sz="1" w:space="0" w:color="C5D5E8"/>
               <w:left w:val="single" w:sz="1" w:space="0" w:color="C5D5E8"/>
@@ -31670,7 +31612,7 @@
         </w:tc>
         <w:tc>
           <w:tcPr>
-            <w:tcW w:w="2361" w:type="dxa"/>
+            <w:tcW w:w="1679" w:type="dxa"/>
             <w:tcBorders>
               <w:top w:val="single" w:sz="1" w:space="0" w:color="C5D5E8"/>
               <w:left w:val="single" w:sz="1" w:space="0" w:color="C5D5E8"/>
@@ -31684,6 +31626,7 @@
               <w:bottom w:w="80" w:type="dxa"/>
               <w:right w:w="120" w:type="dxa"/>
             </w:tcMar>
+            <w:vAlign w:val="center"/>
           </w:tcPr>
           <w:p>
             <w:pPr>
@@ -31702,7 +31645,7 @@
         </w:tc>
         <w:tc>
           <w:tcPr>
-            <w:tcW w:w="1813" w:type="dxa"/>
+            <w:tcW w:w="2552" w:type="dxa"/>
             <w:tcBorders>
               <w:top w:val="single" w:sz="1" w:space="0" w:color="C5D5E8"/>
               <w:left w:val="single" w:sz="1" w:space="0" w:color="C5D5E8"/>
@@ -31710,6 +31653,7 @@
               <w:right w:val="single" w:sz="1" w:space="0" w:color="C5D5E8"/>
             </w:tcBorders>
             <w:shd w:val="clear" w:color="auto" w:fill="F4F7FB"/>
+            <w:vAlign w:val="center"/>
           </w:tcPr>
           <w:p>
             <w:pPr>
@@ -31728,132 +31672,6 @@
         </w:tc>
       </w:tr>
     </w:tbl>
-    <w:p>
-      <w:pPr>
-        <w:pBdr>
-          <w:bottom w:val="single" w:sz="8" w:space="4" w:color="0D7377"/>
-        </w:pBdr>
-        <w:spacing w:before="360" w:after="160"/>
-        <w:rPr>
-          <w:rFonts w:ascii="Cambria" w:eastAsia="Georgia" w:hAnsi="Cambria" w:cs="Georgia"/>
-          <w:b/>
-          <w:bCs/>
-          <w:caps/>
-          <w:color w:val="1B3A5C"/>
-          <w:spacing w:val="40"/>
-          <w:sz w:val="28"/>
-          <w:szCs w:val="28"/>
-        </w:rPr>
-      </w:pPr>
-    </w:p>
-    <w:p>
-      <w:pPr>
-        <w:pBdr>
-          <w:bottom w:val="single" w:sz="8" w:space="4" w:color="0D7377"/>
-        </w:pBdr>
-        <w:spacing w:before="360" w:after="160"/>
-        <w:rPr>
-          <w:rFonts w:ascii="Cambria" w:eastAsia="Georgia" w:hAnsi="Cambria" w:cs="Georgia"/>
-          <w:b/>
-          <w:bCs/>
-          <w:caps/>
-          <w:color w:val="1B3A5C"/>
-          <w:spacing w:val="40"/>
-          <w:sz w:val="28"/>
-          <w:szCs w:val="28"/>
-        </w:rPr>
-      </w:pPr>
-    </w:p>
-    <w:p>
-      <w:pPr>
-        <w:pBdr>
-          <w:bottom w:val="single" w:sz="8" w:space="4" w:color="0D7377"/>
-        </w:pBdr>
-        <w:spacing w:before="360" w:after="160"/>
-        <w:rPr>
-          <w:rFonts w:ascii="Cambria" w:eastAsia="Georgia" w:hAnsi="Cambria" w:cs="Georgia"/>
-          <w:b/>
-          <w:bCs/>
-          <w:caps/>
-          <w:color w:val="1B3A5C"/>
-          <w:spacing w:val="40"/>
-          <w:sz w:val="28"/>
-          <w:szCs w:val="28"/>
-        </w:rPr>
-      </w:pPr>
-    </w:p>
-    <w:p>
-      <w:pPr>
-        <w:pBdr>
-          <w:bottom w:val="single" w:sz="8" w:space="4" w:color="0D7377"/>
-        </w:pBdr>
-        <w:spacing w:before="360" w:after="160"/>
-        <w:rPr>
-          <w:rFonts w:ascii="Cambria" w:eastAsia="Georgia" w:hAnsi="Cambria" w:cs="Georgia"/>
-          <w:b/>
-          <w:bCs/>
-          <w:caps/>
-          <w:color w:val="1B3A5C"/>
-          <w:spacing w:val="40"/>
-          <w:sz w:val="28"/>
-          <w:szCs w:val="28"/>
-        </w:rPr>
-      </w:pPr>
-    </w:p>
-    <w:p>
-      <w:pPr>
-        <w:pBdr>
-          <w:bottom w:val="single" w:sz="8" w:space="4" w:color="0D7377"/>
-        </w:pBdr>
-        <w:spacing w:before="360" w:after="160"/>
-        <w:rPr>
-          <w:rFonts w:ascii="Cambria" w:eastAsia="Georgia" w:hAnsi="Cambria" w:cs="Georgia"/>
-          <w:b/>
-          <w:bCs/>
-          <w:caps/>
-          <w:color w:val="1B3A5C"/>
-          <w:spacing w:val="40"/>
-          <w:sz w:val="28"/>
-          <w:szCs w:val="28"/>
-        </w:rPr>
-      </w:pPr>
-    </w:p>
-    <w:p>
-      <w:pPr>
-        <w:pBdr>
-          <w:bottom w:val="single" w:sz="8" w:space="4" w:color="0D7377"/>
-        </w:pBdr>
-        <w:spacing w:before="360" w:after="160"/>
-        <w:rPr>
-          <w:rFonts w:ascii="Cambria" w:eastAsia="Georgia" w:hAnsi="Cambria" w:cs="Georgia"/>
-          <w:b/>
-          <w:bCs/>
-          <w:caps/>
-          <w:color w:val="1B3A5C"/>
-          <w:spacing w:val="40"/>
-          <w:sz w:val="28"/>
-          <w:szCs w:val="28"/>
-        </w:rPr>
-      </w:pPr>
-    </w:p>
-    <w:p>
-      <w:pPr>
-        <w:pBdr>
-          <w:bottom w:val="single" w:sz="8" w:space="4" w:color="0D7377"/>
-        </w:pBdr>
-        <w:spacing w:before="360" w:after="160"/>
-        <w:rPr>
-          <w:rFonts w:ascii="Cambria" w:eastAsia="Georgia" w:hAnsi="Cambria" w:cs="Georgia"/>
-          <w:b/>
-          <w:bCs/>
-          <w:caps/>
-          <w:color w:val="1B3A5C"/>
-          <w:spacing w:val="40"/>
-          <w:sz w:val="28"/>
-          <w:szCs w:val="28"/>
-        </w:rPr>
-      </w:pPr>
-    </w:p>
     <w:p>
       <w:pPr>
         <w:pBdr>
@@ -32006,7 +31824,7 @@
                     <pic:cNvPicPr/>
                   </pic:nvPicPr>
                   <pic:blipFill>
-                    <a:blip r:embed="rId8"/>
+                    <a:blip r:embed="rId9"/>
                     <a:stretch>
                       <a:fillRect/>
                     </a:stretch>
@@ -32368,28 +32186,6 @@
         <w:ind w:left="9" w:firstLine="710"/>
         <w:rPr>
           <w:rFonts w:ascii="Cambria" w:hAnsi="Cambria"/>
-          <w:sz w:val="22"/>
-          <w:szCs w:val="22"/>
-        </w:rPr>
-      </w:pPr>
-    </w:p>
-    <w:p>
-      <w:pPr>
-        <w:spacing w:after="107"/>
-        <w:ind w:left="9" w:firstLine="710"/>
-        <w:rPr>
-          <w:rFonts w:ascii="Cambria" w:hAnsi="Cambria"/>
-          <w:sz w:val="22"/>
-          <w:szCs w:val="22"/>
-        </w:rPr>
-      </w:pPr>
-    </w:p>
-    <w:p>
-      <w:pPr>
-        <w:spacing w:after="107"/>
-        <w:ind w:left="9" w:firstLine="710"/>
-        <w:rPr>
-          <w:rFonts w:ascii="Cambria" w:hAnsi="Cambria"/>
           <w:b/>
           <w:bCs/>
           <w:sz w:val="22"/>
@@ -32407,18 +32203,6 @@
         </w:rPr>
         <w:t xml:space="preserve">3. Yakuniy natijalar jadvali </w:t>
       </w:r>
-    </w:p>
-    <w:p>
-      <w:pPr>
-        <w:spacing w:line="259" w:lineRule="auto"/>
-        <w:rPr>
-          <w:rFonts w:ascii="Cambria" w:hAnsi="Cambria"/>
-          <w:b/>
-          <w:sz w:val="22"/>
-          <w:szCs w:val="22"/>
-          <w:lang w:val="en-US"/>
-        </w:rPr>
-      </w:pPr>
     </w:p>
     <w:tbl>
       <w:tblPr>
@@ -33327,6 +33111,7 @@
                 <w:szCs w:val="22"/>
                 <w:lang w:val="en-US"/>
               </w:rPr>
+              <w:lastRenderedPageBreak/>
               <w:t>Yillik</w:t>
             </w:r>
             <w:proofErr w:type="spellEnd"/>
@@ -33509,6 +33294,22 @@
         </w:rPr>
         <w:t xml:space="preserve"> </w:t>
       </w:r>
+      <w:r>
+        <w:rPr>
+          <w:rFonts w:ascii="Cambria" w:hAnsi="Cambria"/>
+          <w:sz w:val="22"/>
+          <w:szCs w:val="22"/>
+        </w:rPr>
+        <w:tab/>
+      </w:r>
+      <w:r>
+        <w:rPr>
+          <w:rFonts w:ascii="Cambria" w:hAnsi="Cambria"/>
+          <w:sz w:val="22"/>
+          <w:szCs w:val="22"/>
+        </w:rPr>
+        <w:t xml:space="preserve">Hisob-kitoblarga ko‘ra xonadondagi elektr isitgichlar kuniga taxminan 100 litr issiq suv ishlatadi. Shu sababli quyosh tizimi uchun quyidagi hajm tavsiya etiladi: </w:t>
+      </w:r>
     </w:p>
     <w:p>
       <w:pPr>
@@ -33526,7 +33327,25 @@
           <w:sz w:val="22"/>
           <w:szCs w:val="22"/>
         </w:rPr>
-        <w:t xml:space="preserve">Hisob-kitoblarga ko‘ra xonadondagi elektr isitgichlar kuniga taxminan 100 litr issiq suv ishlatadi. Shu sababli quyosh tizimi uchun quyidagi hajm tavsiya etiladi: </w:t>
+        <w:t xml:space="preserve">Optimal variant: </w:t>
+      </w:r>
+      <w:r>
+        <w:rPr>
+          <w:rFonts w:ascii="Cambria" w:hAnsi="Cambria"/>
+          <w:b/>
+          <w:bCs/>
+          <w:sz w:val="22"/>
+          <w:szCs w:val="22"/>
+        </w:rPr>
+        <w:t>200 –300</w:t>
+      </w:r>
+      <w:r>
+        <w:rPr>
+          <w:rFonts w:ascii="Cambria" w:hAnsi="Cambria"/>
+          <w:sz w:val="22"/>
+          <w:szCs w:val="22"/>
+        </w:rPr>
+        <w:t xml:space="preserve"> litr saqlash (zaxirali, barqaror ishlash) </w:t>
       </w:r>
     </w:p>
     <w:p>
@@ -33545,7 +33364,7 @@
           <w:sz w:val="22"/>
           <w:szCs w:val="22"/>
         </w:rPr>
-        <w:t xml:space="preserve">Optimal variant: </w:t>
+        <w:t xml:space="preserve">Kollektor maydoni: </w:t>
       </w:r>
       <w:r>
         <w:rPr>
@@ -33555,15 +33374,15 @@
           <w:sz w:val="22"/>
           <w:szCs w:val="22"/>
         </w:rPr>
-        <w:t>200 –300</w:t>
-      </w:r>
-      <w:r>
-        <w:rPr>
-          <w:rFonts w:ascii="Cambria" w:hAnsi="Cambria"/>
-          <w:sz w:val="22"/>
-          <w:szCs w:val="22"/>
-        </w:rPr>
-        <w:t xml:space="preserve"> litr saqlash (zaxirali, barqaror ishlash) </w:t>
+        <w:t>2–4 m²</w:t>
+      </w:r>
+      <w:r>
+        <w:rPr>
+          <w:rFonts w:ascii="Cambria" w:hAnsi="Cambria"/>
+          <w:sz w:val="22"/>
+          <w:szCs w:val="22"/>
+        </w:rPr>
+        <w:t xml:space="preserve"> (joy va kollektor turiga qarab) </w:t>
       </w:r>
     </w:p>
     <w:p>
@@ -33572,35 +33391,32 @@
         <w:ind w:left="9" w:firstLine="710"/>
         <w:rPr>
           <w:rFonts w:ascii="Cambria" w:hAnsi="Cambria"/>
-          <w:sz w:val="22"/>
-          <w:szCs w:val="22"/>
-        </w:rPr>
-      </w:pPr>
-      <w:r>
-        <w:rPr>
-          <w:rFonts w:ascii="Cambria" w:hAnsi="Cambria"/>
-          <w:sz w:val="22"/>
-          <w:szCs w:val="22"/>
-        </w:rPr>
-        <w:t xml:space="preserve">Kollektor maydoni: </w:t>
-      </w:r>
-      <w:r>
-        <w:rPr>
-          <w:rFonts w:ascii="Cambria" w:hAnsi="Cambria"/>
           <w:b/>
           <w:bCs/>
           <w:sz w:val="22"/>
           <w:szCs w:val="22"/>
         </w:rPr>
-        <w:t>2–4 m²</w:t>
-      </w:r>
-      <w:r>
-        <w:rPr>
-          <w:rFonts w:ascii="Cambria" w:hAnsi="Cambria"/>
-          <w:sz w:val="22"/>
-          <w:szCs w:val="22"/>
-        </w:rPr>
-        <w:t xml:space="preserve"> (joy va kollektor turiga qarab) </w:t>
+      </w:pPr>
+      <w:r>
+        <w:rPr>
+          <w:rFonts w:ascii="Cambria" w:hAnsi="Cambria"/>
+          <w:b/>
+          <w:bCs/>
+          <w:sz w:val="22"/>
+          <w:szCs w:val="22"/>
+          <w:lang w:val="ru-RU"/>
+        </w:rPr>
+        <w:t xml:space="preserve">4. </w:t>
+      </w:r>
+      <w:r>
+        <w:rPr>
+          <w:rFonts w:ascii="Cambria" w:hAnsi="Cambria"/>
+          <w:b/>
+          <w:bCs/>
+          <w:sz w:val="22"/>
+          <w:szCs w:val="22"/>
+        </w:rPr>
+        <w:t xml:space="preserve">Amaliy tavsiyalar </w:t>
       </w:r>
     </w:p>
     <w:p>
@@ -33609,8 +33425,6 @@
         <w:ind w:left="9" w:firstLine="710"/>
         <w:rPr>
           <w:rFonts w:ascii="Cambria" w:hAnsi="Cambria"/>
-          <w:b/>
-          <w:bCs/>
           <w:sz w:val="22"/>
           <w:szCs w:val="22"/>
         </w:rPr>
@@ -33618,23 +33432,10 @@
       <w:r>
         <w:rPr>
           <w:rFonts w:ascii="Cambria" w:hAnsi="Cambria"/>
-          <w:b/>
-          <w:bCs/>
-          <w:sz w:val="22"/>
-          <w:szCs w:val="22"/>
-          <w:lang w:val="ru-RU"/>
-        </w:rPr>
-        <w:t xml:space="preserve">4. </w:t>
-      </w:r>
-      <w:r>
-        <w:rPr>
-          <w:rFonts w:ascii="Cambria" w:hAnsi="Cambria"/>
-          <w:b/>
-          <w:bCs/>
-          <w:sz w:val="22"/>
-          <w:szCs w:val="22"/>
-        </w:rPr>
-        <w:t xml:space="preserve">Amaliy tavsiyalar </w:t>
+          <w:sz w:val="22"/>
+          <w:szCs w:val="22"/>
+        </w:rPr>
+        <w:t xml:space="preserve">SHNQ 2.04.07-22 “Issiqlik tarmoqlari” shaharsozlik normalari va qoidalarini 3-ilovasiga muvofiq bir kishi uchun bir sutkada minimum 85 litr issiq suv sarflanishidan kelib chiqib, optimal yechim sifatida 200–300 litrli quyosh suv isitgich tizimini o‘rnatish tavsiya etiladi. </w:t>
       </w:r>
     </w:p>
     <w:p>
@@ -33653,7 +33454,7 @@
           <w:sz w:val="22"/>
           <w:szCs w:val="22"/>
         </w:rPr>
-        <w:t xml:space="preserve">SHNQ 2.04.07-22 “Issiqlik tarmoqlari” shaharsozlik normalari va qoidalarini 3-ilovasiga muvofiq bir kishi uchun bir sutkada minimum 85 litr issiq suv sarflanishidan kelib chiqib, optimal yechim sifatida 200–300 litrli quyosh suv isitgich tizimini o‘rnatish tavsiya etiladi. </w:t>
+        <w:t xml:space="preserve">Tizim turi: vakumli ('evacuated tube') kollektor (sovuq iqlimda samaraliroq). </w:t>
       </w:r>
     </w:p>
     <w:p>
@@ -33672,7 +33473,7 @@
           <w:sz w:val="22"/>
           <w:szCs w:val="22"/>
         </w:rPr>
-        <w:t xml:space="preserve">Tizim turi: vakumli ('evacuated tube') kollektor (sovuq iqlimda samaraliroq). </w:t>
+        <w:t xml:space="preserve">Elektr isitgichlar zahira sifatida (backup) qoldiriladi — bulutli kunlarda yordam beradi. </w:t>
       </w:r>
     </w:p>
     <w:p>
@@ -33691,7 +33492,7 @@
           <w:sz w:val="22"/>
           <w:szCs w:val="22"/>
         </w:rPr>
-        <w:t xml:space="preserve">Elektr isitgichlar zahira sifatida (backup) qoldiriladi — bulutli kunlarda yordam beradi. </w:t>
+        <w:t xml:space="preserve">Kollektor janubga qaragan holda, quyosh nurlari maksimal tushadigan burchakda o‘rnatiladi. </w:t>
       </w:r>
     </w:p>
     <w:p>
@@ -33710,40 +33511,8 @@
           <w:sz w:val="22"/>
           <w:szCs w:val="22"/>
         </w:rPr>
-        <w:t xml:space="preserve">Kollektor janubga qaragan holda, quyosh nurlari maksimal tushadigan burchakda o‘rnatiladi. </w:t>
-      </w:r>
-    </w:p>
-    <w:p>
-      <w:pPr>
-        <w:spacing w:after="107"/>
-        <w:ind w:left="9" w:firstLine="710"/>
-        <w:rPr>
-          <w:rFonts w:ascii="Cambria" w:hAnsi="Cambria"/>
-          <w:sz w:val="22"/>
-          <w:szCs w:val="22"/>
-        </w:rPr>
-      </w:pPr>
-      <w:r>
-        <w:rPr>
-          <w:rFonts w:ascii="Cambria" w:hAnsi="Cambria"/>
-          <w:sz w:val="22"/>
-          <w:szCs w:val="22"/>
-        </w:rPr>
         <w:t xml:space="preserve">Yillik texnik ko‘rik va tizimni tozalash samaradorlikni saqlab turadi. </w:t>
       </w:r>
-    </w:p>
-    <w:p>
-      <w:pPr>
-        <w:spacing w:before="200" w:after="80"/>
-        <w:rPr>
-          <w:rFonts w:ascii="Cambria" w:eastAsia="Calibri" w:hAnsi="Cambria"/>
-          <w:b/>
-          <w:bCs/>
-          <w:color w:val="2E6DA4"/>
-          <w:sz w:val="22"/>
-          <w:szCs w:val="22"/>
-        </w:rPr>
-      </w:pPr>
     </w:p>
     <w:p>
       <w:pPr>
@@ -34124,7 +33893,7 @@
                     <pic:cNvPicPr/>
                   </pic:nvPicPr>
                   <pic:blipFill rotWithShape="1">
-                    <a:blip r:embed="rId9"/>
+                    <a:blip r:embed="rId10"/>
                     <a:srcRect b="11015"/>
                     <a:stretch>
                       <a:fillRect/>
@@ -34971,7 +34740,6 @@
           <w:sz w:val="22"/>
           <w:szCs w:val="22"/>
         </w:rPr>
-        <w:lastRenderedPageBreak/>
         <w:t xml:space="preserve">V = </w:t>
       </w:r>
       <w:r>
@@ -35029,9 +34797,6 @@
     </w:p>
     <w:p>
       <w:pPr>
-        <w:pBdr>
-          <w:bottom w:val="single" w:sz="8" w:space="23" w:color="0D7377"/>
-        </w:pBdr>
         <w:tabs>
           <w:tab w:val="center" w:pos="4819"/>
           <w:tab w:val="left" w:pos="7429"/>
@@ -35109,31 +34874,6 @@
           <w:szCs w:val="22"/>
         </w:rPr>
         <w:t>}}</w:t>
-      </w:r>
-    </w:p>
-    <w:p>
-      <w:pPr>
-        <w:pBdr>
-          <w:bottom w:val="single" w:sz="8" w:space="23" w:color="0D7377"/>
-        </w:pBdr>
-        <w:tabs>
-          <w:tab w:val="center" w:pos="4819"/>
-          <w:tab w:val="left" w:pos="7429"/>
-        </w:tabs>
-        <w:spacing w:before="360" w:after="160"/>
-        <w:rPr>
-          <w:rFonts w:ascii="Cambria" w:hAnsi="Cambria"/>
-          <w:b/>
-          <w:bCs/>
-        </w:rPr>
-      </w:pPr>
-      <w:r>
-        <w:rPr>
-          <w:rFonts w:ascii="Cambria" w:hAnsi="Cambria"/>
-          <w:b/>
-          <w:bCs/>
-        </w:rPr>
-        <w:tab/>
       </w:r>
     </w:p>
     <w:p>
@@ -35144,6 +34884,7 @@
         <w:spacing w:before="360" w:after="160"/>
         <w:rPr>
           <w:rFonts w:ascii="Cambria" w:hAnsi="Cambria"/>
+          <w:lang w:val="en-US"/>
         </w:rPr>
       </w:pPr>
       <w:r>
@@ -35156,8 +34897,22 @@
           <w:spacing w:val="40"/>
           <w:sz w:val="28"/>
           <w:szCs w:val="28"/>
-        </w:rPr>
-        <w:t>VI.Ekologik baholash</w:t>
+          <w:lang w:val="en-US"/>
+        </w:rPr>
+        <w:t>vi.</w:t>
+      </w:r>
+      <w:r>
+        <w:rPr>
+          <w:rFonts w:ascii="Cambria" w:eastAsia="Georgia" w:hAnsi="Cambria" w:cs="Georgia"/>
+          <w:b/>
+          <w:bCs/>
+          <w:caps/>
+          <w:color w:val="1B3A5C"/>
+          <w:spacing w:val="40"/>
+          <w:sz w:val="28"/>
+          <w:szCs w:val="28"/>
+        </w:rPr>
+        <w:t>Ekologik baholash</w:t>
       </w:r>
     </w:p>
     <w:p>
@@ -35176,6 +34931,7 @@
           <w:sz w:val="22"/>
           <w:szCs w:val="22"/>
         </w:rPr>
+        <w:lastRenderedPageBreak/>
         <w:t xml:space="preserve">CO₂ chiqindilarining kamayishi:  </w:t>
       </w:r>
     </w:p>
@@ -37169,7 +36925,6 @@
           <w:sz w:val="22"/>
           <w:szCs w:val="22"/>
         </w:rPr>
-        <w:lastRenderedPageBreak/>
         <w:t>bu yerda: Dd = (t</w:t>
       </w:r>
       <w:r>
@@ -37700,6 +37455,7 @@
           <w:sz w:val="22"/>
           <w:szCs w:val="22"/>
         </w:rPr>
+        <w:lastRenderedPageBreak/>
         <w:t xml:space="preserve">Hisoblangan energiya isteʼmoli qiymati — </w:t>
       </w:r>
       <w:r>
@@ -42071,6 +41827,7 @@
                 <w:szCs w:val="22"/>
                 <w:lang w:val="en-US"/>
               </w:rPr>
+              <w:lastRenderedPageBreak/>
               <w:t>Solishtirma</w:t>
             </w:r>
             <w:proofErr w:type="spellEnd"/>
@@ -42833,9 +42590,24 @@
                 <w:rFonts w:ascii="Cambria" w:hAnsi="Cambria"/>
                 <w:sz w:val="22"/>
                 <w:szCs w:val="22"/>
-                <w:lang w:val="en-US"/>
-              </w:rPr>
-              <w:t xml:space="preserve">10 </w:t>
+              </w:rPr>
+              <w:t>{{co2_tot</w:t>
+            </w:r>
+            <w:r>
+              <w:rPr>
+                <w:rFonts w:ascii="Cambria" w:hAnsi="Cambria"/>
+                <w:sz w:val="22"/>
+                <w:szCs w:val="22"/>
+              </w:rPr>
+              <w:t>_new</w:t>
+            </w:r>
+            <w:r>
+              <w:rPr>
+                <w:rFonts w:ascii="Cambria" w:hAnsi="Cambria"/>
+                <w:sz w:val="22"/>
+                <w:szCs w:val="22"/>
+              </w:rPr>
+              <w:t>}}</w:t>
             </w:r>
             <w:r>
               <w:rPr>
@@ -42854,6 +42626,8 @@
         <w:spacing w:after="21" w:line="259" w:lineRule="auto"/>
         <w:rPr>
           <w:rFonts w:ascii="Cambria" w:hAnsi="Cambria"/>
+          <w:sz w:val="4"/>
+          <w:szCs w:val="4"/>
         </w:rPr>
       </w:pPr>
     </w:p>
@@ -42901,13 +42675,13 @@
           <w:szCs w:val="22"/>
         </w:rPr>
         <w:drawing>
-          <wp:anchor distT="0" distB="0" distL="114300" distR="114300" simplePos="0" relativeHeight="251694080" behindDoc="0" locked="0" layoutInCell="1" allowOverlap="1" wp14:anchorId="3A888E8A" wp14:editId="7548FEDC">
+          <wp:anchor distT="0" distB="0" distL="114300" distR="114300" simplePos="0" relativeHeight="251694080" behindDoc="0" locked="0" layoutInCell="1" allowOverlap="1" wp14:anchorId="3A888E8A" wp14:editId="218D00F2">
             <wp:simplePos x="0" y="0"/>
             <wp:positionH relativeFrom="column">
-              <wp:posOffset>5551314</wp:posOffset>
+              <wp:posOffset>5531998</wp:posOffset>
             </wp:positionH>
             <wp:positionV relativeFrom="paragraph">
-              <wp:posOffset>67859</wp:posOffset>
+              <wp:posOffset>105337</wp:posOffset>
             </wp:positionV>
             <wp:extent cx="363122" cy="1072382"/>
             <wp:effectExtent l="0" t="0" r="0" b="0"/>
@@ -42924,7 +42698,7 @@
                     <pic:cNvPicPr/>
                   </pic:nvPicPr>
                   <pic:blipFill rotWithShape="1">
-                    <a:blip r:embed="rId10" cstate="print">
+                    <a:blip r:embed="rId11" cstate="print">
                       <a:extLst>
                         <a:ext uri="{28A0092B-C50C-407E-A947-70E740481C1C}">
                           <a14:useLocalDpi xmlns:a14="http://schemas.microsoft.com/office/drawing/2010/main" val="0"/>
@@ -43147,9 +42921,9 @@
       </w:r>
     </w:p>
     <w:sectPr>
-      <w:headerReference w:type="default" r:id="rId11"/>
-      <w:footerReference w:type="even" r:id="rId12"/>
-      <w:footerReference w:type="default" r:id="rId13"/>
+      <w:headerReference w:type="default" r:id="rId12"/>
+      <w:footerReference w:type="even" r:id="rId13"/>
+      <w:footerReference w:type="default" r:id="rId14"/>
       <w:pgSz w:w="11906" w:h="16838"/>
       <w:pgMar w:top="1134" w:right="707" w:bottom="1134" w:left="1560" w:header="517" w:footer="582" w:gutter="0"/>
       <w:cols w:space="720"/>
@@ -48332,4 +48106,16 @@
   <we:bindings/>
   <we:snapshot xmlns:r="http://schemas.openxmlformats.org/officeDocument/2006/relationships"/>
 </we:webextension>
+</file>
+
+<file path=customXml/item1.xml><?xml version="1.0" encoding="utf-8"?>
+<b:Sources xmlns:b="http://schemas.openxmlformats.org/officeDocument/2006/bibliography" xmlns="http://schemas.openxmlformats.org/officeDocument/2006/bibliography" SelectedStyle="/APASixthEditionOfficeOnline.xsl" StyleName="APA" Version="6"/>
+</file>
+
+<file path=customXml/itemProps1.xml><?xml version="1.0" encoding="utf-8"?>
+<ds:datastoreItem xmlns:ds="http://schemas.openxmlformats.org/officeDocument/2006/customXml" ds:itemID="{AD89E533-62AE-B14A-B516-C59499AB8A01}">
+  <ds:schemaRefs>
+    <ds:schemaRef ds:uri="http://schemas.openxmlformats.org/officeDocument/2006/bibliography"/>
+  </ds:schemaRefs>
+</ds:datastoreItem>
 </file>
</xml_diff>